<commit_message>
Add live portfolio URL to all CVs; refresh CV assets
Portfolio https://edgarhovsepyan.github.io added to premium/ATS/branded CVs
and the .docx; refreshed public/cv/ download copies and the site download.

Co-Authored-By: Claude Opus 4.8 <noreply@anthropic.com>
</commit_message>
<xml_diff>
--- a/Edgar_Hovsepyan_CV_2026.docx
+++ b/Edgar_Hovsepyan_CV_2026.docx
@@ -56,7 +56,7 @@
       <w:pPr>
         <w:spacing w:after="40"/>
       </w:pPr>
-      <w:hyperlink w:history="1" r:id="rIdpkxyeycuzunrz4c2ouck3">
+      <w:hyperlink w:history="1" r:id="rIdxjucym1gzyrd2rxacuqh9">
         <w:r>
           <w:rPr>
             <w:u w:val="single"/>
@@ -74,7 +74,7 @@
         </w:rPr>
         <w:t xml:space="preserve">  ·  </w:t>
       </w:r>
-      <w:hyperlink w:history="1" r:id="rIdyn-_7ddxw4dqyml14gjlq">
+      <w:hyperlink w:history="1" r:id="rIdcwibiqcbwp2-9k9ncczjs">
         <w:r>
           <w:rPr>
             <w:u w:val="single"/>
@@ -92,7 +92,7 @@
         </w:rPr>
         <w:t xml:space="preserve">  ·  </w:t>
       </w:r>
-      <w:hyperlink w:history="1" r:id="rIddl23q9wxzidj87x1-kuvz">
+      <w:hyperlink w:history="1" r:id="rId8ohbzncl5zwetmixufjmy">
         <w:r>
           <w:rPr>
             <w:u w:val="single"/>
@@ -101,6 +101,24 @@
             <w:szCs w:val="18"/>
           </w:rPr>
           <w:t xml:space="preserve">t.me/Dev_777</w:t>
+        </w:r>
+      </w:hyperlink>
+      <w:r>
+        <w:rPr>
+          <w:sz w:val="19"/>
+          <w:szCs w:val="19"/>
+        </w:rPr>
+        <w:t xml:space="preserve">  ·  </w:t>
+      </w:r>
+      <w:hyperlink w:history="1" r:id="rIdb16kh9do6eswvdoo6b2j5">
+        <w:r>
+          <w:rPr>
+            <w:u w:val="single"/>
+            <w:color w:val="1A4D8F"/>
+            <w:sz w:val="18"/>
+            <w:szCs w:val="18"/>
+          </w:rPr>
+          <w:t xml:space="preserve">edgarhovsepyan.github.io</w:t>
         </w:r>
       </w:hyperlink>
     </w:p>

</xml_diff>

<commit_message>
build(cv): regenerate all CV downloads with senior action-verbs
Re-rendered every CV artifact from the updated generators so the shipped
downloads carry the verb upgrades (Own and ship / Optimized win-ceremony /
Co-developed) instead of stale 'Develop and ship' / 'Sustain' / 'Contributed'.

Sources: cv-print.html (ATS), cv-print-branded.html, cv-print-premium.html.
Outputs refreshed in public/cv/, public/, and top-level (ATS PDF+DOCX, Branded
PDF, Premium PDF). ATS PDF/DOCX + Branded pass every ATS parse rule; premium
stays the designed two-column human version.
</commit_message>
<xml_diff>
--- a/Edgar_Hovsepyan_CV_2026.docx
+++ b/Edgar_Hovsepyan_CV_2026.docx
@@ -227,7 +227,7 @@
           <w:sz w:val="19"/>
           <w:szCs w:val="19"/>
         </w:rPr>
-        <w:t xml:space="preserve">Develop and ship Pascal Gaming’s full casino catalogue in full-cycle PixiJS v8 / TypeScript across 14+ game verticals — slots, live &amp; 3D roulette, blackjack, baccarat, Hi-Lo, crash, Plinko, Mines, poker and Deal-or-No-Deal.</w:t>
+        <w:t xml:space="preserve">Own and ship Pascal Gaming’s full casino catalogue full-cycle in PixiJS v8 / TypeScript across 14+ game verticals — slots, live &amp; 3D roulette, blackjack, baccarat, Hi-Lo, crash, Plinko, Mines, poker and Deal-or-No-Deal.</w:t>
       </w:r>
     </w:p>
     <w:p>
@@ -295,7 +295,7 @@
           <w:sz w:val="19"/>
           <w:szCs w:val="19"/>
         </w:rPr>
-        <w:t xml:space="preserve">Sustain 120 fps on mid-tier mobile during win ceremonies via draw-call batching, GPU instancing and zero-GC object pooling.</w:t>
+        <w:t xml:space="preserve">Optimized win-ceremony rendering to a sustained 120 fps on mid-tier mobile via draw-call batching, GPU instancing and zero-GC object pooling.</w:t>
       </w:r>
     </w:p>
     <w:p>

</xml_diff>